<commit_message>
Melhoria do caso de uso
</commit_message>
<xml_diff>
--- a/docs/DOCUMENTO-DE-ARQUITETURA-DE-SOFTWARE.docx
+++ b/docs/DOCUMENTO-DE-ARQUITETURA-DE-SOFTWARE.docx
@@ -2706,7 +2706,7 @@
         </w:rPr>
         <w:fldChar w:fldCharType="separate"/>
       </w:r>
-      <w:hyperlink w:anchor="_Toc223898549" w:history="1">
+      <w:hyperlink w:anchor="_Toc225289724" w:history="1">
         <w:r>
           <w:rPr>
             <w:rStyle w:val="Hyperlink"/>
@@ -2741,7 +2741,7 @@
             <w:noProof/>
             <w:webHidden/>
           </w:rPr>
-          <w:instrText xml:space="preserve"> PAGEREF _Toc223898549 \h </w:instrText>
+          <w:instrText xml:space="preserve"> PAGEREF _Toc225289724 \h </w:instrText>
         </w:r>
         <w:r>
           <w:rPr>
@@ -2784,7 +2784,7 @@
           <w14:ligatures w14:val="standardContextual"/>
         </w:rPr>
       </w:pPr>
-      <w:hyperlink w:anchor="_Toc223898550" w:history="1">
+      <w:hyperlink w:anchor="_Toc225289725" w:history="1">
         <w:r>
           <w:rPr>
             <w:rStyle w:val="Hyperlink"/>
@@ -2811,7 +2811,7 @@
             <w:noProof/>
             <w:webHidden/>
           </w:rPr>
-          <w:instrText xml:space="preserve"> PAGEREF _Toc223898550 \h </w:instrText>
+          <w:instrText xml:space="preserve"> PAGEREF _Toc225289725 \h </w:instrText>
         </w:r>
         <w:r>
           <w:rPr>
@@ -2854,7 +2854,7 @@
           <w14:ligatures w14:val="standardContextual"/>
         </w:rPr>
       </w:pPr>
-      <w:hyperlink w:anchor="_Toc223898551" w:history="1">
+      <w:hyperlink w:anchor="_Toc225289726" w:history="1">
         <w:r>
           <w:rPr>
             <w:rStyle w:val="Hyperlink"/>
@@ -2881,7 +2881,7 @@
             <w:noProof/>
             <w:webHidden/>
           </w:rPr>
-          <w:instrText xml:space="preserve"> PAGEREF _Toc223898551 \h </w:instrText>
+          <w:instrText xml:space="preserve"> PAGEREF _Toc225289726 \h </w:instrText>
         </w:r>
         <w:r>
           <w:rPr>
@@ -2924,7 +2924,7 @@
           <w14:ligatures w14:val="standardContextual"/>
         </w:rPr>
       </w:pPr>
-      <w:hyperlink w:anchor="_Toc223898552" w:history="1">
+      <w:hyperlink w:anchor="_Toc225289727" w:history="1">
         <w:r>
           <w:rPr>
             <w:rStyle w:val="Hyperlink"/>
@@ -2951,7 +2951,7 @@
             <w:noProof/>
             <w:webHidden/>
           </w:rPr>
-          <w:instrText xml:space="preserve"> PAGEREF _Toc223898552 \h </w:instrText>
+          <w:instrText xml:space="preserve"> PAGEREF _Toc225289727 \h </w:instrText>
         </w:r>
         <w:r>
           <w:rPr>
@@ -2999,7 +2999,7 @@
           <w14:ligatures w14:val="standardContextual"/>
         </w:rPr>
       </w:pPr>
-      <w:hyperlink w:anchor="_Toc223898553" w:history="1">
+      <w:hyperlink w:anchor="_Toc225289728" w:history="1">
         <w:r>
           <w:rPr>
             <w:rStyle w:val="Hyperlink"/>
@@ -3026,7 +3026,7 @@
             <w:noProof/>
             <w:webHidden/>
           </w:rPr>
-          <w:instrText xml:space="preserve"> PAGEREF _Toc223898553 \h </w:instrText>
+          <w:instrText xml:space="preserve"> PAGEREF _Toc225289728 \h </w:instrText>
         </w:r>
         <w:r>
           <w:rPr>
@@ -3074,7 +3074,7 @@
           <w14:ligatures w14:val="standardContextual"/>
         </w:rPr>
       </w:pPr>
-      <w:hyperlink w:anchor="_Toc223898554" w:history="1">
+      <w:hyperlink w:anchor="_Toc225289729" w:history="1">
         <w:r>
           <w:rPr>
             <w:rStyle w:val="Hyperlink"/>
@@ -3101,7 +3101,7 @@
             <w:noProof/>
             <w:webHidden/>
           </w:rPr>
-          <w:instrText xml:space="preserve"> PAGEREF _Toc223898554 \h </w:instrText>
+          <w:instrText xml:space="preserve"> PAGEREF _Toc225289729 \h </w:instrText>
         </w:r>
         <w:r>
           <w:rPr>
@@ -3149,7 +3149,7 @@
           <w14:ligatures w14:val="standardContextual"/>
         </w:rPr>
       </w:pPr>
-      <w:hyperlink w:anchor="_Toc223898555" w:history="1">
+      <w:hyperlink w:anchor="_Toc225289730" w:history="1">
         <w:r>
           <w:rPr>
             <w:rStyle w:val="Hyperlink"/>
@@ -3176,7 +3176,7 @@
             <w:noProof/>
             <w:webHidden/>
           </w:rPr>
-          <w:instrText xml:space="preserve"> PAGEREF _Toc223898555 \h </w:instrText>
+          <w:instrText xml:space="preserve"> PAGEREF _Toc225289730 \h </w:instrText>
         </w:r>
         <w:r>
           <w:rPr>
@@ -3196,7 +3196,7 @@
             <w:noProof/>
             <w:webHidden/>
           </w:rPr>
-          <w:t>10</w:t>
+          <w:t>9</w:t>
         </w:r>
         <w:r>
           <w:rPr>
@@ -3219,7 +3219,7 @@
           <w14:ligatures w14:val="standardContextual"/>
         </w:rPr>
       </w:pPr>
-      <w:hyperlink w:anchor="_Toc223898556" w:history="1">
+      <w:hyperlink w:anchor="_Toc225289731" w:history="1">
         <w:r>
           <w:rPr>
             <w:rStyle w:val="Hyperlink"/>
@@ -3255,7 +3255,7 @@
             <w:noProof/>
             <w:webHidden/>
           </w:rPr>
-          <w:instrText xml:space="preserve"> PAGEREF _Toc223898556 \h </w:instrText>
+          <w:instrText xml:space="preserve"> PAGEREF _Toc225289731 \h </w:instrText>
         </w:r>
         <w:r>
           <w:rPr>
@@ -3298,7 +3298,7 @@
           <w14:ligatures w14:val="standardContextual"/>
         </w:rPr>
       </w:pPr>
-      <w:hyperlink w:anchor="_Toc223898557" w:history="1">
+      <w:hyperlink w:anchor="_Toc225289732" w:history="1">
         <w:r>
           <w:rPr>
             <w:rStyle w:val="Hyperlink"/>
@@ -3334,7 +3334,7 @@
             <w:noProof/>
             <w:webHidden/>
           </w:rPr>
-          <w:instrText xml:space="preserve"> PAGEREF _Toc223898557 \h </w:instrText>
+          <w:instrText xml:space="preserve"> PAGEREF _Toc225289732 \h </w:instrText>
         </w:r>
         <w:r>
           <w:rPr>
@@ -3354,7 +3354,7 @@
             <w:noProof/>
             <w:webHidden/>
           </w:rPr>
-          <w:t>12</w:t>
+          <w:t>11</w:t>
         </w:r>
         <w:r>
           <w:rPr>
@@ -3377,7 +3377,7 @@
           <w14:ligatures w14:val="standardContextual"/>
         </w:rPr>
       </w:pPr>
-      <w:hyperlink w:anchor="_Toc223898558" w:history="1">
+      <w:hyperlink w:anchor="_Toc225289733" w:history="1">
         <w:r>
           <w:rPr>
             <w:rStyle w:val="Hyperlink"/>
@@ -3413,7 +3413,7 @@
             <w:noProof/>
             <w:webHidden/>
           </w:rPr>
-          <w:instrText xml:space="preserve"> PAGEREF _Toc223898558 \h </w:instrText>
+          <w:instrText xml:space="preserve"> PAGEREF _Toc225289733 \h </w:instrText>
         </w:r>
         <w:r>
           <w:rPr>
@@ -3433,7 +3433,7 @@
             <w:noProof/>
             <w:webHidden/>
           </w:rPr>
-          <w:t>12</w:t>
+          <w:t>11</w:t>
         </w:r>
         <w:r>
           <w:rPr>
@@ -3456,7 +3456,7 @@
           <w14:ligatures w14:val="standardContextual"/>
         </w:rPr>
       </w:pPr>
-      <w:hyperlink w:anchor="_Toc223898559" w:history="1">
+      <w:hyperlink w:anchor="_Toc225289734" w:history="1">
         <w:r>
           <w:rPr>
             <w:rStyle w:val="Hyperlink"/>
@@ -3492,7 +3492,7 @@
             <w:noProof/>
             <w:webHidden/>
           </w:rPr>
-          <w:instrText xml:space="preserve"> PAGEREF _Toc223898559 \h </w:instrText>
+          <w:instrText xml:space="preserve"> PAGEREF _Toc225289734 \h </w:instrText>
         </w:r>
         <w:r>
           <w:rPr>
@@ -3512,7 +3512,7 @@
             <w:noProof/>
             <w:webHidden/>
           </w:rPr>
-          <w:t>13</w:t>
+          <w:t>12</w:t>
         </w:r>
         <w:r>
           <w:rPr>
@@ -3535,7 +3535,7 @@
           <w14:ligatures w14:val="standardContextual"/>
         </w:rPr>
       </w:pPr>
-      <w:hyperlink w:anchor="_Toc223898560" w:history="1">
+      <w:hyperlink w:anchor="_Toc225289735" w:history="1">
         <w:r>
           <w:rPr>
             <w:rStyle w:val="Hyperlink"/>
@@ -3571,7 +3571,7 @@
             <w:noProof/>
             <w:webHidden/>
           </w:rPr>
-          <w:instrText xml:space="preserve"> PAGEREF _Toc223898560 \h </w:instrText>
+          <w:instrText xml:space="preserve"> PAGEREF _Toc225289735 \h </w:instrText>
         </w:r>
         <w:r>
           <w:rPr>
@@ -3591,7 +3591,7 @@
             <w:noProof/>
             <w:webHidden/>
           </w:rPr>
-          <w:t>13</w:t>
+          <w:t>12</w:t>
         </w:r>
         <w:r>
           <w:rPr>
@@ -3614,7 +3614,7 @@
           <w14:ligatures w14:val="standardContextual"/>
         </w:rPr>
       </w:pPr>
-      <w:hyperlink w:anchor="_Toc223898561" w:history="1">
+      <w:hyperlink w:anchor="_Toc225289736" w:history="1">
         <w:r>
           <w:rPr>
             <w:rStyle w:val="Hyperlink"/>
@@ -3650,7 +3650,7 @@
             <w:noProof/>
             <w:webHidden/>
           </w:rPr>
-          <w:instrText xml:space="preserve"> PAGEREF _Toc223898561 \h </w:instrText>
+          <w:instrText xml:space="preserve"> PAGEREF _Toc225289736 \h </w:instrText>
         </w:r>
         <w:r>
           <w:rPr>
@@ -3693,7 +3693,7 @@
           <w14:ligatures w14:val="standardContextual"/>
         </w:rPr>
       </w:pPr>
-      <w:hyperlink w:anchor="_Toc223898562" w:history="1">
+      <w:hyperlink w:anchor="_Toc225289737" w:history="1">
         <w:r>
           <w:rPr>
             <w:rStyle w:val="Hyperlink"/>
@@ -3729,7 +3729,7 @@
             <w:noProof/>
             <w:webHidden/>
           </w:rPr>
-          <w:instrText xml:space="preserve"> PAGEREF _Toc223898562 \h </w:instrText>
+          <w:instrText xml:space="preserve"> PAGEREF _Toc225289737 \h </w:instrText>
         </w:r>
         <w:r>
           <w:rPr>
@@ -3749,7 +3749,7 @@
             <w:noProof/>
             <w:webHidden/>
           </w:rPr>
-          <w:t>14</w:t>
+          <w:t>13</w:t>
         </w:r>
         <w:r>
           <w:rPr>
@@ -3777,7 +3777,7 @@
           <w14:ligatures w14:val="standardContextual"/>
         </w:rPr>
       </w:pPr>
-      <w:hyperlink w:anchor="_Toc223898563" w:history="1">
+      <w:hyperlink w:anchor="_Toc225289738" w:history="1">
         <w:r>
           <w:rPr>
             <w:rStyle w:val="Hyperlink"/>
@@ -3804,7 +3804,7 @@
             <w:noProof/>
             <w:webHidden/>
           </w:rPr>
-          <w:instrText xml:space="preserve"> PAGEREF _Toc223898563 \h </w:instrText>
+          <w:instrText xml:space="preserve"> PAGEREF _Toc225289738 \h </w:instrText>
         </w:r>
         <w:r>
           <w:rPr>
@@ -3824,7 +3824,7 @@
             <w:noProof/>
             <w:webHidden/>
           </w:rPr>
-          <w:t>14</w:t>
+          <w:t>13</w:t>
         </w:r>
         <w:r>
           <w:rPr>
@@ -3847,7 +3847,7 @@
           <w14:ligatures w14:val="standardContextual"/>
         </w:rPr>
       </w:pPr>
-      <w:hyperlink w:anchor="_Toc223898564" w:history="1">
+      <w:hyperlink w:anchor="_Toc225289739" w:history="1">
         <w:r>
           <w:rPr>
             <w:rStyle w:val="Hyperlink"/>
@@ -3883,7 +3883,147 @@
             <w:noProof/>
             <w:webHidden/>
           </w:rPr>
-          <w:instrText xml:space="preserve"> PAGEREF _Toc223898564 \h </w:instrText>
+          <w:instrText xml:space="preserve"> PAGEREF _Toc225289739 \h </w:instrText>
+        </w:r>
+        <w:r>
+          <w:rPr>
+            <w:noProof/>
+            <w:webHidden/>
+          </w:rPr>
+        </w:r>
+        <w:r>
+          <w:rPr>
+            <w:noProof/>
+            <w:webHidden/>
+          </w:rPr>
+          <w:fldChar w:fldCharType="separate"/>
+        </w:r>
+        <w:r>
+          <w:rPr>
+            <w:noProof/>
+            <w:webHidden/>
+          </w:rPr>
+          <w:t>15</w:t>
+        </w:r>
+        <w:r>
+          <w:rPr>
+            <w:noProof/>
+            <w:webHidden/>
+          </w:rPr>
+          <w:fldChar w:fldCharType="end"/>
+        </w:r>
+      </w:hyperlink>
+    </w:p>
+    <w:p>
+      <w:pPr>
+        <w:pStyle w:val="Sumrio2"/>
+        <w:rPr>
+          <w:rFonts w:asciiTheme="minorHAnsi" w:hAnsiTheme="minorHAnsi"/>
+          <w:noProof/>
+          <w:kern w:val="2"/>
+          <w:szCs w:val="24"/>
+          <w:lang w:val="pt-BR" w:eastAsia="pt-BR"/>
+          <w14:ligatures w14:val="standardContextual"/>
+        </w:rPr>
+      </w:pPr>
+      <w:hyperlink w:anchor="_Toc225289740" w:history="1">
+        <w:r>
+          <w:rPr>
+            <w:rStyle w:val="Hyperlink"/>
+            <w:noProof/>
+          </w:rPr>
+          <w:t>5.2 Módulo de Renderização</w:t>
+        </w:r>
+        <w:r>
+          <w:rPr>
+            <w:noProof/>
+            <w:webHidden/>
+          </w:rPr>
+          <w:tab/>
+        </w:r>
+        <w:r>
+          <w:rPr>
+            <w:noProof/>
+            <w:webHidden/>
+          </w:rPr>
+          <w:fldChar w:fldCharType="begin"/>
+        </w:r>
+        <w:r>
+          <w:rPr>
+            <w:noProof/>
+            <w:webHidden/>
+          </w:rPr>
+          <w:instrText xml:space="preserve"> PAGEREF _Toc225289740 \h </w:instrText>
+        </w:r>
+        <w:r>
+          <w:rPr>
+            <w:noProof/>
+            <w:webHidden/>
+          </w:rPr>
+        </w:r>
+        <w:r>
+          <w:rPr>
+            <w:noProof/>
+            <w:webHidden/>
+          </w:rPr>
+          <w:fldChar w:fldCharType="separate"/>
+        </w:r>
+        <w:r>
+          <w:rPr>
+            <w:noProof/>
+            <w:webHidden/>
+          </w:rPr>
+          <w:t>15</w:t>
+        </w:r>
+        <w:r>
+          <w:rPr>
+            <w:noProof/>
+            <w:webHidden/>
+          </w:rPr>
+          <w:fldChar w:fldCharType="end"/>
+        </w:r>
+      </w:hyperlink>
+    </w:p>
+    <w:p>
+      <w:pPr>
+        <w:pStyle w:val="Sumrio2"/>
+        <w:rPr>
+          <w:rFonts w:asciiTheme="minorHAnsi" w:hAnsiTheme="minorHAnsi"/>
+          <w:noProof/>
+          <w:kern w:val="2"/>
+          <w:szCs w:val="24"/>
+          <w:lang w:val="pt-BR" w:eastAsia="pt-BR"/>
+          <w14:ligatures w14:val="standardContextual"/>
+        </w:rPr>
+      </w:pPr>
+      <w:hyperlink w:anchor="_Toc225289741" w:history="1">
+        <w:r>
+          <w:rPr>
+            <w:rStyle w:val="Hyperlink"/>
+            <w:noProof/>
+          </w:rPr>
+          <w:t>5.3 Módulo de Entidades</w:t>
+        </w:r>
+        <w:r>
+          <w:rPr>
+            <w:noProof/>
+            <w:webHidden/>
+          </w:rPr>
+          <w:tab/>
+        </w:r>
+        <w:r>
+          <w:rPr>
+            <w:noProof/>
+            <w:webHidden/>
+          </w:rPr>
+          <w:fldChar w:fldCharType="begin"/>
+        </w:r>
+        <w:r>
+          <w:rPr>
+            <w:noProof/>
+            <w:webHidden/>
+          </w:rPr>
+          <w:instrText xml:space="preserve"> PAGEREF _Toc225289741 \h </w:instrText>
         </w:r>
         <w:r>
           <w:rPr>
@@ -3926,13 +4066,13 @@
           <w14:ligatures w14:val="standardContextual"/>
         </w:rPr>
       </w:pPr>
-      <w:hyperlink w:anchor="_Toc223898565" w:history="1">
+      <w:hyperlink w:anchor="_Toc225289742" w:history="1">
         <w:r>
           <w:rPr>
             <w:rStyle w:val="Hyperlink"/>
             <w:noProof/>
           </w:rPr>
-          <w:t>5.2 Módulo de Renderização</w:t>
+          <w:t>5.4 Módulo de Colisão</w:t>
         </w:r>
         <w:r>
           <w:rPr>
@@ -3953,7 +4093,7 @@
             <w:noProof/>
             <w:webHidden/>
           </w:rPr>
-          <w:instrText xml:space="preserve"> PAGEREF _Toc223898565 \h </w:instrText>
+          <w:instrText xml:space="preserve"> PAGEREF _Toc225289742 \h </w:instrText>
         </w:r>
         <w:r>
           <w:rPr>
@@ -3996,13 +4136,13 @@
           <w14:ligatures w14:val="standardContextual"/>
         </w:rPr>
       </w:pPr>
-      <w:hyperlink w:anchor="_Toc223898566" w:history="1">
+      <w:hyperlink w:anchor="_Toc225289743" w:history="1">
         <w:r>
           <w:rPr>
             <w:rStyle w:val="Hyperlink"/>
             <w:noProof/>
           </w:rPr>
-          <w:t>5.3 Módulo de Entidades</w:t>
+          <w:t>5.5 Módulo de Entrada</w:t>
         </w:r>
         <w:r>
           <w:rPr>
@@ -4023,7 +4163,7 @@
             <w:noProof/>
             <w:webHidden/>
           </w:rPr>
-          <w:instrText xml:space="preserve"> PAGEREF _Toc223898566 \h </w:instrText>
+          <w:instrText xml:space="preserve"> PAGEREF _Toc225289743 \h </w:instrText>
         </w:r>
         <w:r>
           <w:rPr>
@@ -4066,13 +4206,13 @@
           <w14:ligatures w14:val="standardContextual"/>
         </w:rPr>
       </w:pPr>
-      <w:hyperlink w:anchor="_Toc223898567" w:history="1">
+      <w:hyperlink w:anchor="_Toc225289744" w:history="1">
         <w:r>
           <w:rPr>
             <w:rStyle w:val="Hyperlink"/>
             <w:noProof/>
           </w:rPr>
-          <w:t>5.4 Módulo de Colisão</w:t>
+          <w:t>5.6 Módulo de Gerenciamento de Recursos</w:t>
         </w:r>
         <w:r>
           <w:rPr>
@@ -4093,7 +4233,7 @@
             <w:noProof/>
             <w:webHidden/>
           </w:rPr>
-          <w:instrText xml:space="preserve"> PAGEREF _Toc223898567 \h </w:instrText>
+          <w:instrText xml:space="preserve"> PAGEREF _Toc225289744 \h </w:instrText>
         </w:r>
         <w:r>
           <w:rPr>
@@ -4136,13 +4276,13 @@
           <w14:ligatures w14:val="standardContextual"/>
         </w:rPr>
       </w:pPr>
-      <w:hyperlink w:anchor="_Toc223898568" w:history="1">
+      <w:hyperlink w:anchor="_Toc225289745" w:history="1">
         <w:r>
           <w:rPr>
             <w:rStyle w:val="Hyperlink"/>
             <w:noProof/>
           </w:rPr>
-          <w:t>5.5 Módulo de Entrada</w:t>
+          <w:t>5.7 Módulo de Gerenciamento de Cenas</w:t>
         </w:r>
         <w:r>
           <w:rPr>
@@ -4163,7 +4303,7 @@
             <w:noProof/>
             <w:webHidden/>
           </w:rPr>
-          <w:instrText xml:space="preserve"> PAGEREF _Toc223898568 \h </w:instrText>
+          <w:instrText xml:space="preserve"> PAGEREF _Toc225289745 \h </w:instrText>
         </w:r>
         <w:r>
           <w:rPr>
@@ -4196,146 +4336,6 @@
     </w:p>
     <w:p>
       <w:pPr>
-        <w:pStyle w:val="Sumrio2"/>
-        <w:rPr>
-          <w:rFonts w:asciiTheme="minorHAnsi" w:hAnsiTheme="minorHAnsi"/>
-          <w:noProof/>
-          <w:kern w:val="2"/>
-          <w:szCs w:val="24"/>
-          <w:lang w:val="pt-BR" w:eastAsia="pt-BR"/>
-          <w14:ligatures w14:val="standardContextual"/>
-        </w:rPr>
-      </w:pPr>
-      <w:hyperlink w:anchor="_Toc223898569" w:history="1">
-        <w:r>
-          <w:rPr>
-            <w:rStyle w:val="Hyperlink"/>
-            <w:noProof/>
-          </w:rPr>
-          <w:t>5.6 Módulo de Gerenciamento de Recursos</w:t>
-        </w:r>
-        <w:r>
-          <w:rPr>
-            <w:noProof/>
-            <w:webHidden/>
-          </w:rPr>
-          <w:tab/>
-        </w:r>
-        <w:r>
-          <w:rPr>
-            <w:noProof/>
-            <w:webHidden/>
-          </w:rPr>
-          <w:fldChar w:fldCharType="begin"/>
-        </w:r>
-        <w:r>
-          <w:rPr>
-            <w:noProof/>
-            <w:webHidden/>
-          </w:rPr>
-          <w:instrText xml:space="preserve"> PAGEREF _Toc223898569 \h </w:instrText>
-        </w:r>
-        <w:r>
-          <w:rPr>
-            <w:noProof/>
-            <w:webHidden/>
-          </w:rPr>
-        </w:r>
-        <w:r>
-          <w:rPr>
-            <w:noProof/>
-            <w:webHidden/>
-          </w:rPr>
-          <w:fldChar w:fldCharType="separate"/>
-        </w:r>
-        <w:r>
-          <w:rPr>
-            <w:noProof/>
-            <w:webHidden/>
-          </w:rPr>
-          <w:t>18</w:t>
-        </w:r>
-        <w:r>
-          <w:rPr>
-            <w:noProof/>
-            <w:webHidden/>
-          </w:rPr>
-          <w:fldChar w:fldCharType="end"/>
-        </w:r>
-      </w:hyperlink>
-    </w:p>
-    <w:p>
-      <w:pPr>
-        <w:pStyle w:val="Sumrio2"/>
-        <w:rPr>
-          <w:rFonts w:asciiTheme="minorHAnsi" w:hAnsiTheme="minorHAnsi"/>
-          <w:noProof/>
-          <w:kern w:val="2"/>
-          <w:szCs w:val="24"/>
-          <w:lang w:val="pt-BR" w:eastAsia="pt-BR"/>
-          <w14:ligatures w14:val="standardContextual"/>
-        </w:rPr>
-      </w:pPr>
-      <w:hyperlink w:anchor="_Toc223898570" w:history="1">
-        <w:r>
-          <w:rPr>
-            <w:rStyle w:val="Hyperlink"/>
-            <w:noProof/>
-          </w:rPr>
-          <w:t>5.7 Módulo de Gerenciamento de Cenas</w:t>
-        </w:r>
-        <w:r>
-          <w:rPr>
-            <w:noProof/>
-            <w:webHidden/>
-          </w:rPr>
-          <w:tab/>
-        </w:r>
-        <w:r>
-          <w:rPr>
-            <w:noProof/>
-            <w:webHidden/>
-          </w:rPr>
-          <w:fldChar w:fldCharType="begin"/>
-        </w:r>
-        <w:r>
-          <w:rPr>
-            <w:noProof/>
-            <w:webHidden/>
-          </w:rPr>
-          <w:instrText xml:space="preserve"> PAGEREF _Toc223898570 \h </w:instrText>
-        </w:r>
-        <w:r>
-          <w:rPr>
-            <w:noProof/>
-            <w:webHidden/>
-          </w:rPr>
-        </w:r>
-        <w:r>
-          <w:rPr>
-            <w:noProof/>
-            <w:webHidden/>
-          </w:rPr>
-          <w:fldChar w:fldCharType="separate"/>
-        </w:r>
-        <w:r>
-          <w:rPr>
-            <w:noProof/>
-            <w:webHidden/>
-          </w:rPr>
-          <w:t>19</w:t>
-        </w:r>
-        <w:r>
-          <w:rPr>
-            <w:noProof/>
-            <w:webHidden/>
-          </w:rPr>
-          <w:fldChar w:fldCharType="end"/>
-        </w:r>
-      </w:hyperlink>
-    </w:p>
-    <w:p>
-      <w:pPr>
         <w:pStyle w:val="Sumrio1"/>
         <w:tabs>
           <w:tab w:val="right" w:leader="dot" w:pos="9062"/>
@@ -4351,7 +4351,7 @@
           <w14:ligatures w14:val="standardContextual"/>
         </w:rPr>
       </w:pPr>
-      <w:hyperlink w:anchor="_Toc223898571" w:history="1">
+      <w:hyperlink w:anchor="_Toc225289746" w:history="1">
         <w:r>
           <w:rPr>
             <w:rStyle w:val="Hyperlink"/>
@@ -4387,7 +4387,217 @@
             <w:noProof/>
             <w:webHidden/>
           </w:rPr>
-          <w:instrText xml:space="preserve"> PAGEREF _Toc223898571 \h </w:instrText>
+          <w:instrText xml:space="preserve"> PAGEREF _Toc225289746 \h </w:instrText>
+        </w:r>
+        <w:r>
+          <w:rPr>
+            <w:noProof/>
+            <w:webHidden/>
+          </w:rPr>
+        </w:r>
+        <w:r>
+          <w:rPr>
+            <w:noProof/>
+            <w:webHidden/>
+          </w:rPr>
+          <w:fldChar w:fldCharType="separate"/>
+        </w:r>
+        <w:r>
+          <w:rPr>
+            <w:noProof/>
+            <w:webHidden/>
+          </w:rPr>
+          <w:t>19</w:t>
+        </w:r>
+        <w:r>
+          <w:rPr>
+            <w:noProof/>
+            <w:webHidden/>
+          </w:rPr>
+          <w:fldChar w:fldCharType="end"/>
+        </w:r>
+      </w:hyperlink>
+    </w:p>
+    <w:p>
+      <w:pPr>
+        <w:pStyle w:val="Sumrio2"/>
+        <w:rPr>
+          <w:rFonts w:asciiTheme="minorHAnsi" w:hAnsiTheme="minorHAnsi"/>
+          <w:noProof/>
+          <w:kern w:val="2"/>
+          <w:szCs w:val="24"/>
+          <w:lang w:val="pt-BR" w:eastAsia="pt-BR"/>
+          <w14:ligatures w14:val="standardContextual"/>
+        </w:rPr>
+      </w:pPr>
+      <w:hyperlink w:anchor="_Toc225289747" w:history="1">
+        <w:r>
+          <w:rPr>
+            <w:rStyle w:val="Hyperlink"/>
+            <w:noProof/>
+          </w:rPr>
+          <w:t>6.1 Inicialização do Sistema</w:t>
+        </w:r>
+        <w:r>
+          <w:rPr>
+            <w:noProof/>
+            <w:webHidden/>
+          </w:rPr>
+          <w:tab/>
+        </w:r>
+        <w:r>
+          <w:rPr>
+            <w:noProof/>
+            <w:webHidden/>
+          </w:rPr>
+          <w:fldChar w:fldCharType="begin"/>
+        </w:r>
+        <w:r>
+          <w:rPr>
+            <w:noProof/>
+            <w:webHidden/>
+          </w:rPr>
+          <w:instrText xml:space="preserve"> PAGEREF _Toc225289747 \h </w:instrText>
+        </w:r>
+        <w:r>
+          <w:rPr>
+            <w:noProof/>
+            <w:webHidden/>
+          </w:rPr>
+        </w:r>
+        <w:r>
+          <w:rPr>
+            <w:noProof/>
+            <w:webHidden/>
+          </w:rPr>
+          <w:fldChar w:fldCharType="separate"/>
+        </w:r>
+        <w:r>
+          <w:rPr>
+            <w:noProof/>
+            <w:webHidden/>
+          </w:rPr>
+          <w:t>19</w:t>
+        </w:r>
+        <w:r>
+          <w:rPr>
+            <w:noProof/>
+            <w:webHidden/>
+          </w:rPr>
+          <w:fldChar w:fldCharType="end"/>
+        </w:r>
+      </w:hyperlink>
+    </w:p>
+    <w:p>
+      <w:pPr>
+        <w:pStyle w:val="Sumrio2"/>
+        <w:rPr>
+          <w:rFonts w:asciiTheme="minorHAnsi" w:hAnsiTheme="minorHAnsi"/>
+          <w:noProof/>
+          <w:kern w:val="2"/>
+          <w:szCs w:val="24"/>
+          <w:lang w:val="pt-BR" w:eastAsia="pt-BR"/>
+          <w14:ligatures w14:val="standardContextual"/>
+        </w:rPr>
+      </w:pPr>
+      <w:hyperlink w:anchor="_Toc225289748" w:history="1">
+        <w:r>
+          <w:rPr>
+            <w:rStyle w:val="Hyperlink"/>
+            <w:noProof/>
+          </w:rPr>
+          <w:t>6.2 Processamento de Entrada</w:t>
+        </w:r>
+        <w:r>
+          <w:rPr>
+            <w:noProof/>
+            <w:webHidden/>
+          </w:rPr>
+          <w:tab/>
+        </w:r>
+        <w:r>
+          <w:rPr>
+            <w:noProof/>
+            <w:webHidden/>
+          </w:rPr>
+          <w:fldChar w:fldCharType="begin"/>
+        </w:r>
+        <w:r>
+          <w:rPr>
+            <w:noProof/>
+            <w:webHidden/>
+          </w:rPr>
+          <w:instrText xml:space="preserve"> PAGEREF _Toc225289748 \h </w:instrText>
+        </w:r>
+        <w:r>
+          <w:rPr>
+            <w:noProof/>
+            <w:webHidden/>
+          </w:rPr>
+        </w:r>
+        <w:r>
+          <w:rPr>
+            <w:noProof/>
+            <w:webHidden/>
+          </w:rPr>
+          <w:fldChar w:fldCharType="separate"/>
+        </w:r>
+        <w:r>
+          <w:rPr>
+            <w:noProof/>
+            <w:webHidden/>
+          </w:rPr>
+          <w:t>19</w:t>
+        </w:r>
+        <w:r>
+          <w:rPr>
+            <w:noProof/>
+            <w:webHidden/>
+          </w:rPr>
+          <w:fldChar w:fldCharType="end"/>
+        </w:r>
+      </w:hyperlink>
+    </w:p>
+    <w:p>
+      <w:pPr>
+        <w:pStyle w:val="Sumrio2"/>
+        <w:rPr>
+          <w:rFonts w:asciiTheme="minorHAnsi" w:hAnsiTheme="minorHAnsi"/>
+          <w:noProof/>
+          <w:kern w:val="2"/>
+          <w:szCs w:val="24"/>
+          <w:lang w:val="pt-BR" w:eastAsia="pt-BR"/>
+          <w14:ligatures w14:val="standardContextual"/>
+        </w:rPr>
+      </w:pPr>
+      <w:hyperlink w:anchor="_Toc225289749" w:history="1">
+        <w:r>
+          <w:rPr>
+            <w:rStyle w:val="Hyperlink"/>
+            <w:noProof/>
+          </w:rPr>
+          <w:t>6.3 Atualização da Lógica do Jogo</w:t>
+        </w:r>
+        <w:r>
+          <w:rPr>
+            <w:noProof/>
+            <w:webHidden/>
+          </w:rPr>
+          <w:tab/>
+        </w:r>
+        <w:r>
+          <w:rPr>
+            <w:noProof/>
+            <w:webHidden/>
+          </w:rPr>
+          <w:fldChar w:fldCharType="begin"/>
+        </w:r>
+        <w:r>
+          <w:rPr>
+            <w:noProof/>
+            <w:webHidden/>
+          </w:rPr>
+          <w:instrText xml:space="preserve"> PAGEREF _Toc225289749 \h </w:instrText>
         </w:r>
         <w:r>
           <w:rPr>
@@ -4430,13 +4640,13 @@
           <w14:ligatures w14:val="standardContextual"/>
         </w:rPr>
       </w:pPr>
-      <w:hyperlink w:anchor="_Toc223898572" w:history="1">
+      <w:hyperlink w:anchor="_Toc225289750" w:history="1">
         <w:r>
           <w:rPr>
             <w:rStyle w:val="Hyperlink"/>
             <w:noProof/>
           </w:rPr>
-          <w:t>6.1 Inicialização do Sistema</w:t>
+          <w:t>6.4 Detecção de Colisões</w:t>
         </w:r>
         <w:r>
           <w:rPr>
@@ -4457,7 +4667,7 @@
             <w:noProof/>
             <w:webHidden/>
           </w:rPr>
-          <w:instrText xml:space="preserve"> PAGEREF _Toc223898572 \h </w:instrText>
+          <w:instrText xml:space="preserve"> PAGEREF _Toc225289750 \h </w:instrText>
         </w:r>
         <w:r>
           <w:rPr>
@@ -4500,13 +4710,13 @@
           <w14:ligatures w14:val="standardContextual"/>
         </w:rPr>
       </w:pPr>
-      <w:hyperlink w:anchor="_Toc223898573" w:history="1">
+      <w:hyperlink w:anchor="_Toc225289751" w:history="1">
         <w:r>
           <w:rPr>
             <w:rStyle w:val="Hyperlink"/>
             <w:noProof/>
           </w:rPr>
-          <w:t>6.2 Processamento de Entrada</w:t>
+          <w:t>6.5 Renderização da Cena</w:t>
         </w:r>
         <w:r>
           <w:rPr>
@@ -4527,77 +4737,7 @@
             <w:noProof/>
             <w:webHidden/>
           </w:rPr>
-          <w:instrText xml:space="preserve"> PAGEREF _Toc223898573 \h </w:instrText>
-        </w:r>
-        <w:r>
-          <w:rPr>
-            <w:noProof/>
-            <w:webHidden/>
-          </w:rPr>
-        </w:r>
-        <w:r>
-          <w:rPr>
-            <w:noProof/>
-            <w:webHidden/>
-          </w:rPr>
-          <w:fldChar w:fldCharType="separate"/>
-        </w:r>
-        <w:r>
-          <w:rPr>
-            <w:noProof/>
-            <w:webHidden/>
-          </w:rPr>
-          <w:t>20</w:t>
-        </w:r>
-        <w:r>
-          <w:rPr>
-            <w:noProof/>
-            <w:webHidden/>
-          </w:rPr>
-          <w:fldChar w:fldCharType="end"/>
-        </w:r>
-      </w:hyperlink>
-    </w:p>
-    <w:p>
-      <w:pPr>
-        <w:pStyle w:val="Sumrio2"/>
-        <w:rPr>
-          <w:rFonts w:asciiTheme="minorHAnsi" w:hAnsiTheme="minorHAnsi"/>
-          <w:noProof/>
-          <w:kern w:val="2"/>
-          <w:szCs w:val="24"/>
-          <w:lang w:val="pt-BR" w:eastAsia="pt-BR"/>
-          <w14:ligatures w14:val="standardContextual"/>
-        </w:rPr>
-      </w:pPr>
-      <w:hyperlink w:anchor="_Toc223898574" w:history="1">
-        <w:r>
-          <w:rPr>
-            <w:rStyle w:val="Hyperlink"/>
-            <w:noProof/>
-          </w:rPr>
-          <w:t>6.3 Atualização da Lógica do Jogo</w:t>
-        </w:r>
-        <w:r>
-          <w:rPr>
-            <w:noProof/>
-            <w:webHidden/>
-          </w:rPr>
-          <w:tab/>
-        </w:r>
-        <w:r>
-          <w:rPr>
-            <w:noProof/>
-            <w:webHidden/>
-          </w:rPr>
-          <w:fldChar w:fldCharType="begin"/>
-        </w:r>
-        <w:r>
-          <w:rPr>
-            <w:noProof/>
-            <w:webHidden/>
-          </w:rPr>
-          <w:instrText xml:space="preserve"> PAGEREF _Toc223898574 \h </w:instrText>
+          <w:instrText xml:space="preserve"> PAGEREF _Toc225289751 \h </w:instrText>
         </w:r>
         <w:r>
           <w:rPr>
@@ -4640,13 +4780,13 @@
           <w14:ligatures w14:val="standardContextual"/>
         </w:rPr>
       </w:pPr>
-      <w:hyperlink w:anchor="_Toc223898575" w:history="1">
+      <w:hyperlink w:anchor="_Toc225289752" w:history="1">
         <w:r>
           <w:rPr>
             <w:rStyle w:val="Hyperlink"/>
             <w:noProof/>
           </w:rPr>
-          <w:t>6.4 Detecção de Colisões</w:t>
+          <w:t>6.6 Encerramento da Aplicação</w:t>
         </w:r>
         <w:r>
           <w:rPr>
@@ -4667,7 +4807,7 @@
             <w:noProof/>
             <w:webHidden/>
           </w:rPr>
-          <w:instrText xml:space="preserve"> PAGEREF _Toc223898575 \h </w:instrText>
+          <w:instrText xml:space="preserve"> PAGEREF _Toc225289752 \h </w:instrText>
         </w:r>
         <w:r>
           <w:rPr>
@@ -4700,23 +4840,28 @@
     </w:p>
     <w:p>
       <w:pPr>
-        <w:pStyle w:val="Sumrio2"/>
+        <w:pStyle w:val="Sumrio1"/>
+        <w:tabs>
+          <w:tab w:val="right" w:leader="dot" w:pos="9062"/>
+        </w:tabs>
         <w:rPr>
           <w:rFonts w:asciiTheme="minorHAnsi" w:hAnsiTheme="minorHAnsi"/>
+          <w:b w:val="0"/>
           <w:noProof/>
           <w:kern w:val="2"/>
+          <w:sz w:val="24"/>
           <w:szCs w:val="24"/>
           <w:lang w:val="pt-BR" w:eastAsia="pt-BR"/>
           <w14:ligatures w14:val="standardContextual"/>
         </w:rPr>
       </w:pPr>
-      <w:hyperlink w:anchor="_Toc223898576" w:history="1">
+      <w:hyperlink w:anchor="_Toc225289753" w:history="1">
         <w:r>
           <w:rPr>
             <w:rStyle w:val="Hyperlink"/>
             <w:noProof/>
           </w:rPr>
-          <w:t>6.5 Renderização da Cena</w:t>
+          <w:t>7 Diagramas</w:t>
         </w:r>
         <w:r>
           <w:rPr>
@@ -4737,7 +4882,7 @@
             <w:noProof/>
             <w:webHidden/>
           </w:rPr>
-          <w:instrText xml:space="preserve"> PAGEREF _Toc223898576 \h </w:instrText>
+          <w:instrText xml:space="preserve"> PAGEREF _Toc225289753 \h </w:instrText>
         </w:r>
         <w:r>
           <w:rPr>
@@ -4757,7 +4902,7 @@
             <w:noProof/>
             <w:webHidden/>
           </w:rPr>
-          <w:t>22</w:t>
+          <w:t>21</w:t>
         </w:r>
         <w:r>
           <w:rPr>
@@ -4780,13 +4925,13 @@
           <w14:ligatures w14:val="standardContextual"/>
         </w:rPr>
       </w:pPr>
-      <w:hyperlink w:anchor="_Toc223898577" w:history="1">
+      <w:hyperlink w:anchor="_Toc225289754" w:history="1">
         <w:r>
           <w:rPr>
             <w:rStyle w:val="Hyperlink"/>
             <w:noProof/>
           </w:rPr>
-          <w:t>6.6 Encerramento da Aplicação</w:t>
+          <w:t>7.1 Caso de Uso</w:t>
         </w:r>
         <w:r>
           <w:rPr>
@@ -4807,7 +4952,7 @@
             <w:noProof/>
             <w:webHidden/>
           </w:rPr>
-          <w:instrText xml:space="preserve"> PAGEREF _Toc223898577 \h </w:instrText>
+          <w:instrText xml:space="preserve"> PAGEREF _Toc225289754 \h </w:instrText>
         </w:r>
         <w:r>
           <w:rPr>
@@ -4827,7 +4972,7 @@
             <w:noProof/>
             <w:webHidden/>
           </w:rPr>
-          <w:t>22</w:t>
+          <w:t>21</w:t>
         </w:r>
         <w:r>
           <w:rPr>
@@ -4879,7 +5024,7 @@
           <w:rFonts w:cs="Arial"/>
         </w:rPr>
       </w:pPr>
-      <w:bookmarkStart w:id="0" w:name="_Toc223898549"/>
+      <w:bookmarkStart w:id="0" w:name="_Toc225289724"/>
       <w:r>
         <w:rPr>
           <w:rFonts w:cs="Arial"/>
@@ -4910,7 +5055,7 @@
       <w:pPr>
         <w:pStyle w:val="Ttulo2"/>
       </w:pPr>
-      <w:bookmarkStart w:id="1" w:name="_Toc223898550"/>
+      <w:bookmarkStart w:id="1" w:name="_Toc225289725"/>
       <w:r>
         <w:t xml:space="preserve">1.1 </w:t>
       </w:r>
@@ -5916,7 +6061,7 @@
       <w:pPr>
         <w:pStyle w:val="Ttulo2"/>
       </w:pPr>
-      <w:bookmarkStart w:id="2" w:name="_Toc223898551"/>
+      <w:bookmarkStart w:id="2" w:name="_Toc225289726"/>
       <w:r>
         <w:t xml:space="preserve">1.2 </w:t>
       </w:r>
@@ -6947,7 +7092,7 @@
       <w:pPr>
         <w:pStyle w:val="Ttulo2"/>
       </w:pPr>
-      <w:bookmarkStart w:id="3" w:name="_Toc223898552"/>
+      <w:bookmarkStart w:id="3" w:name="_Toc225289727"/>
       <w:r>
         <w:t xml:space="preserve">1.3 </w:t>
       </w:r>
@@ -7592,7 +7737,7 @@
       <w:pPr>
         <w:pStyle w:val="Ttulo1"/>
       </w:pPr>
-      <w:bookmarkStart w:id="4" w:name="_Toc223898553"/>
+      <w:bookmarkStart w:id="4" w:name="_Toc225289728"/>
       <w:r>
         <w:t>2 VISÃO GERAL DA ARQUITETURA</w:t>
       </w:r>
@@ -10939,83 +11084,12 @@
           <w:rFonts w:ascii="Arial" w:hAnsi="Arial" w:cs="Arial"/>
         </w:rPr>
       </w:pPr>
-      <w:r>
-        <w:rPr>
-          <w:noProof/>
-        </w:rPr>
-        <w:drawing>
-          <wp:inline distT="0" distB="0" distL="0" distR="0">
-            <wp:extent cx="5972175" cy="3204845"/>
-            <wp:effectExtent l="0" t="0" r="9525" b="0"/>
-            <wp:docPr id="1029936727" name="Imagem 3"/>
-            <wp:cNvGraphicFramePr>
-              <a:graphicFrameLocks xmlns:a="http://schemas.openxmlformats.org/drawingml/2006/main" noChangeAspect="1"/>
-            </wp:cNvGraphicFramePr>
-            <a:graphic xmlns:a="http://schemas.openxmlformats.org/drawingml/2006/main">
-              <a:graphicData uri="http://schemas.openxmlformats.org/drawingml/2006/picture">
-                <pic:pic xmlns:pic="http://schemas.openxmlformats.org/drawingml/2006/picture">
-                  <pic:nvPicPr>
-                    <pic:cNvPr id="0" name="Picture 5"/>
-                    <pic:cNvPicPr>
-                      <a:picLocks noChangeAspect="1" noChangeArrowheads="1"/>
-                    </pic:cNvPicPr>
-                  </pic:nvPicPr>
-                  <pic:blipFill>
-                    <a:blip r:embed="rId8">
-                      <a:extLst>
-                        <a:ext uri="{28A0092B-C50C-407E-A947-70E740481C1C}">
-                          <a14:useLocalDpi xmlns:a14="http://schemas.microsoft.com/office/drawing/2010/main" val="0"/>
-                        </a:ext>
-                      </a:extLst>
-                    </a:blip>
-                    <a:srcRect/>
-                    <a:stretch>
-                      <a:fillRect/>
-                    </a:stretch>
-                  </pic:blipFill>
-                  <pic:spPr bwMode="auto">
-                    <a:xfrm>
-                      <a:off x="0" y="0"/>
-                      <a:ext cx="5972175" cy="3204845"/>
-                    </a:xfrm>
-                    <a:prstGeom prst="rect">
-                      <a:avLst/>
-                    </a:prstGeom>
-                    <a:noFill/>
-                    <a:ln>
-                      <a:noFill/>
-                    </a:ln>
-                  </pic:spPr>
-                </pic:pic>
-              </a:graphicData>
-            </a:graphic>
-          </wp:inline>
-        </w:drawing>
-      </w:r>
     </w:p>
     <w:p>
       <w:pPr>
-        <w:ind w:firstLine="0"/>
-        <w:jc w:val="both"/>
-        <w:rPr>
-          <w:rFonts w:ascii="Arial" w:hAnsi="Arial" w:cs="Arial"/>
-        </w:rPr>
-      </w:pPr>
-    </w:p>
-    <w:p>
-      <w:pPr>
-        <w:ind w:firstLine="0"/>
-        <w:jc w:val="both"/>
-        <w:rPr>
-          <w:rFonts w:ascii="Arial" w:hAnsi="Arial" w:cs="Arial"/>
-        </w:rPr>
-      </w:pPr>
-    </w:p>
-    <w:p>
-      <w:pPr>
         <w:pStyle w:val="Ttulo1"/>
       </w:pPr>
-      <w:bookmarkStart w:id="5" w:name="_Toc223898554"/>
+      <w:bookmarkStart w:id="5" w:name="_Toc225289729"/>
       <w:r>
         <w:t>3 ESTILO ARQUITETURAL</w:t>
       </w:r>
@@ -12545,6 +12619,7 @@
         <w:rPr>
           <w:rFonts w:ascii="Arial" w:hAnsi="Arial" w:cs="Arial"/>
         </w:rPr>
+        <w:lastRenderedPageBreak/>
         <w:t>Responsável</w:t>
       </w:r>
       <w:proofErr w:type="spellEnd"/>
@@ -13797,7 +13872,6 @@
         <w:rPr>
           <w:rFonts w:ascii="Arial" w:hAnsi="Arial" w:cs="Arial"/>
         </w:rPr>
-        <w:lastRenderedPageBreak/>
         <w:t>comuniquem</w:t>
       </w:r>
       <w:proofErr w:type="spellEnd"/>
@@ -14212,7 +14286,7 @@
       <w:pPr>
         <w:pStyle w:val="Ttulo1"/>
       </w:pPr>
-      <w:bookmarkStart w:id="6" w:name="_Toc223898555"/>
+      <w:bookmarkStart w:id="6" w:name="_Toc225289730"/>
       <w:r>
         <w:t>4 COMPONENTES DO SISTEMA</w:t>
       </w:r>
@@ -14422,6 +14496,7 @@
         <w:rPr>
           <w:rFonts w:ascii="Arial" w:hAnsi="Arial" w:cs="Arial"/>
         </w:rPr>
+        <w:lastRenderedPageBreak/>
         <w:t>componente</w:t>
       </w:r>
       <w:proofErr w:type="spellEnd"/>
@@ -15033,7 +15108,6 @@
         <w:rPr>
           <w:noProof/>
         </w:rPr>
-        <w:lastRenderedPageBreak/>
         <w:drawing>
           <wp:inline distT="0" distB="0" distL="0" distR="0">
             <wp:extent cx="5133975" cy="5886450"/>
@@ -15052,7 +15126,7 @@
                     </pic:cNvPicPr>
                   </pic:nvPicPr>
                   <pic:blipFill>
-                    <a:blip r:embed="rId9">
+                    <a:blip r:embed="rId8">
                       <a:extLst>
                         <a:ext uri="{28A0092B-C50C-407E-A947-70E740481C1C}">
                           <a14:useLocalDpi xmlns:a14="http://schemas.microsoft.com/office/drawing/2010/main" val="0"/>
@@ -15097,7 +15171,7 @@
       <w:pPr>
         <w:pStyle w:val="Ttulo2"/>
       </w:pPr>
-      <w:bookmarkStart w:id="7" w:name="_Toc223898556"/>
+      <w:bookmarkStart w:id="7" w:name="_Toc225289731"/>
       <w:r>
         <w:t xml:space="preserve">4.1 </w:t>
       </w:r>
@@ -15309,7 +15383,6 @@
         <w:rPr>
           <w:rFonts w:ascii="Arial" w:hAnsi="Arial" w:cs="Arial"/>
         </w:rPr>
-        <w:lastRenderedPageBreak/>
         <w:t xml:space="preserve">Entre </w:t>
       </w:r>
       <w:proofErr w:type="spellStart"/>
@@ -15854,7 +15927,7 @@
       <w:pPr>
         <w:pStyle w:val="Ttulo2"/>
       </w:pPr>
-      <w:bookmarkStart w:id="8" w:name="_Toc223898557"/>
+      <w:bookmarkStart w:id="8" w:name="_Toc225289732"/>
       <w:r>
         <w:t xml:space="preserve">4.2 </w:t>
       </w:r>
@@ -16460,7 +16533,7 @@
       <w:pPr>
         <w:pStyle w:val="Ttulo2"/>
       </w:pPr>
-      <w:bookmarkStart w:id="9" w:name="_Toc223898558"/>
+      <w:bookmarkStart w:id="9" w:name="_Toc225289733"/>
       <w:r>
         <w:t xml:space="preserve">4.3 </w:t>
       </w:r>
@@ -16630,6 +16703,7 @@
         <w:rPr>
           <w:rFonts w:ascii="Arial" w:hAnsi="Arial" w:cs="Arial"/>
         </w:rPr>
+        <w:lastRenderedPageBreak/>
         <w:t xml:space="preserve">Uma </w:t>
       </w:r>
       <w:proofErr w:type="spellStart"/>
@@ -17202,9 +17276,8 @@
       <w:pPr>
         <w:pStyle w:val="Ttulo2"/>
       </w:pPr>
-      <w:bookmarkStart w:id="10" w:name="_Toc223898559"/>
-      <w:r>
-        <w:lastRenderedPageBreak/>
+      <w:bookmarkStart w:id="10" w:name="_Toc225289734"/>
+      <w:r>
         <w:t xml:space="preserve">4.4 </w:t>
       </w:r>
       <w:r>
@@ -17827,7 +17900,7 @@
       <w:pPr>
         <w:pStyle w:val="Ttulo2"/>
       </w:pPr>
-      <w:bookmarkStart w:id="11" w:name="_Toc223898560"/>
+      <w:bookmarkStart w:id="11" w:name="_Toc225289735"/>
       <w:r>
         <w:t xml:space="preserve">4.5 </w:t>
       </w:r>
@@ -18429,7 +18502,7 @@
       <w:pPr>
         <w:pStyle w:val="Ttulo2"/>
       </w:pPr>
-      <w:bookmarkStart w:id="12" w:name="_Toc223898561"/>
+      <w:bookmarkStart w:id="12" w:name="_Toc225289736"/>
       <w:r>
         <w:t xml:space="preserve">4.6 </w:t>
       </w:r>
@@ -18585,7 +18658,6 @@
         <w:rPr>
           <w:rFonts w:ascii="Arial" w:hAnsi="Arial" w:cs="Arial"/>
         </w:rPr>
-        <w:lastRenderedPageBreak/>
         <w:t xml:space="preserve">Entre esses </w:t>
       </w:r>
       <w:proofErr w:type="spellStart"/>
@@ -18896,7 +18968,7 @@
       <w:pPr>
         <w:pStyle w:val="Ttulo2"/>
       </w:pPr>
-      <w:bookmarkStart w:id="13" w:name="_Toc223898562"/>
+      <w:bookmarkStart w:id="13" w:name="_Toc225289737"/>
       <w:r>
         <w:t xml:space="preserve">4.7 </w:t>
       </w:r>
@@ -19357,7 +19429,7 @@
       <w:pPr>
         <w:pStyle w:val="Ttulo1"/>
       </w:pPr>
-      <w:bookmarkStart w:id="14" w:name="_Toc223898563"/>
+      <w:bookmarkStart w:id="14" w:name="_Toc225289738"/>
       <w:r>
         <w:t>5 DESCRIÇÃO DOS MÓDULOS</w:t>
       </w:r>
@@ -20006,7 +20078,6 @@
         <w:rPr>
           <w:noProof/>
         </w:rPr>
-        <w:lastRenderedPageBreak/>
         <w:drawing>
           <wp:inline distT="0" distB="0" distL="0" distR="0">
             <wp:extent cx="5972175" cy="7740015"/>
@@ -20025,7 +20096,7 @@
                     </pic:cNvPicPr>
                   </pic:nvPicPr>
                   <pic:blipFill>
-                    <a:blip r:embed="rId10">
+                    <a:blip r:embed="rId9">
                       <a:extLst>
                         <a:ext uri="{28A0092B-C50C-407E-A947-70E740481C1C}">
                           <a14:useLocalDpi xmlns:a14="http://schemas.microsoft.com/office/drawing/2010/main" val="0"/>
@@ -20070,9 +20141,8 @@
       <w:pPr>
         <w:pStyle w:val="Ttulo2"/>
       </w:pPr>
-      <w:bookmarkStart w:id="15" w:name="_Toc223898564"/>
-      <w:r>
-        <w:lastRenderedPageBreak/>
+      <w:bookmarkStart w:id="15" w:name="_Toc225289739"/>
+      <w:r>
         <w:t xml:space="preserve">5.1 </w:t>
       </w:r>
       <w:proofErr w:type="spellStart"/>
@@ -20985,7 +21055,7 @@
       <w:pPr>
         <w:pStyle w:val="Ttulo2"/>
       </w:pPr>
-      <w:bookmarkStart w:id="16" w:name="_Toc223898565"/>
+      <w:bookmarkStart w:id="16" w:name="_Toc225289740"/>
       <w:r>
         <w:t xml:space="preserve">5.2 </w:t>
       </w:r>
@@ -21789,7 +21859,6 @@
         <w:rPr>
           <w:rFonts w:ascii="Arial" w:hAnsi="Arial" w:cs="Arial"/>
         </w:rPr>
-        <w:lastRenderedPageBreak/>
         <w:t xml:space="preserve">Esse </w:t>
       </w:r>
       <w:proofErr w:type="spellStart"/>
@@ -22016,7 +22085,7 @@
       <w:pPr>
         <w:pStyle w:val="Ttulo2"/>
       </w:pPr>
-      <w:bookmarkStart w:id="17" w:name="_Toc223898566"/>
+      <w:bookmarkStart w:id="17" w:name="_Toc225289741"/>
       <w:r>
         <w:t xml:space="preserve">5.3 </w:t>
       </w:r>
@@ -22863,7 +22932,7 @@
       <w:pPr>
         <w:pStyle w:val="Ttulo2"/>
       </w:pPr>
-      <w:bookmarkStart w:id="18" w:name="_Toc223898567"/>
+      <w:bookmarkStart w:id="18" w:name="_Toc225289742"/>
       <w:r>
         <w:t xml:space="preserve">5.4 </w:t>
       </w:r>
@@ -23245,7 +23314,6 @@
         <w:rPr>
           <w:rFonts w:ascii="Arial" w:hAnsi="Arial" w:cs="Arial"/>
         </w:rPr>
-        <w:lastRenderedPageBreak/>
         <w:t xml:space="preserve">Entre </w:t>
       </w:r>
       <w:proofErr w:type="spellStart"/>
@@ -23726,7 +23794,7 @@
       <w:pPr>
         <w:pStyle w:val="Ttulo2"/>
       </w:pPr>
-      <w:bookmarkStart w:id="19" w:name="_Toc223898568"/>
+      <w:bookmarkStart w:id="19" w:name="_Toc225289743"/>
       <w:r>
         <w:t xml:space="preserve">5.5 </w:t>
       </w:r>
@@ -24499,7 +24567,7 @@
       <w:pPr>
         <w:pStyle w:val="Ttulo2"/>
       </w:pPr>
-      <w:bookmarkStart w:id="20" w:name="_Toc223898569"/>
+      <w:bookmarkStart w:id="20" w:name="_Toc225289744"/>
       <w:r>
         <w:t xml:space="preserve">5.6 </w:t>
       </w:r>
@@ -25334,7 +25402,7 @@
       <w:pPr>
         <w:pStyle w:val="Ttulo2"/>
       </w:pPr>
-      <w:bookmarkStart w:id="21" w:name="_Toc223898570"/>
+      <w:bookmarkStart w:id="21" w:name="_Toc225289745"/>
       <w:r>
         <w:t xml:space="preserve">5.7 </w:t>
       </w:r>
@@ -26135,7 +26203,7 @@
       <w:pPr>
         <w:pStyle w:val="Ttulo1"/>
       </w:pPr>
-      <w:bookmarkStart w:id="22" w:name="_Toc223898571"/>
+      <w:bookmarkStart w:id="22" w:name="_Toc225289746"/>
       <w:r>
         <w:lastRenderedPageBreak/>
         <w:t xml:space="preserve">6 FLUXO DE EXECUÇÃO DA </w:t>
@@ -27202,7 +27270,7 @@
       <w:pPr>
         <w:pStyle w:val="Ttulo2"/>
       </w:pPr>
-      <w:bookmarkStart w:id="23" w:name="_Toc223898572"/>
+      <w:bookmarkStart w:id="23" w:name="_Toc225289747"/>
       <w:r>
         <w:t xml:space="preserve">6.1 </w:t>
       </w:r>
@@ -28050,7 +28118,7 @@
       <w:pPr>
         <w:pStyle w:val="Ttulo2"/>
       </w:pPr>
-      <w:bookmarkStart w:id="24" w:name="_Toc223898573"/>
+      <w:bookmarkStart w:id="24" w:name="_Toc225289748"/>
       <w:r>
         <w:t xml:space="preserve">6.2 </w:t>
       </w:r>
@@ -28664,7 +28732,7 @@
       <w:pPr>
         <w:pStyle w:val="Ttulo2"/>
       </w:pPr>
-      <w:bookmarkStart w:id="25" w:name="_Toc223898574"/>
+      <w:bookmarkStart w:id="25" w:name="_Toc225289749"/>
       <w:r>
         <w:t xml:space="preserve">6.3 </w:t>
       </w:r>
@@ -29379,7 +29447,7 @@
       <w:pPr>
         <w:pStyle w:val="Ttulo2"/>
       </w:pPr>
-      <w:bookmarkStart w:id="26" w:name="_Toc223898575"/>
+      <w:bookmarkStart w:id="26" w:name="_Toc225289750"/>
       <w:r>
         <w:t xml:space="preserve">6.4 </w:t>
       </w:r>
@@ -29929,7 +29997,7 @@
       <w:pPr>
         <w:pStyle w:val="Ttulo2"/>
       </w:pPr>
-      <w:bookmarkStart w:id="27" w:name="_Toc223898576"/>
+      <w:bookmarkStart w:id="27" w:name="_Toc225289751"/>
       <w:r>
         <w:t xml:space="preserve">6.5 </w:t>
       </w:r>
@@ -30694,7 +30762,7 @@
       <w:pPr>
         <w:pStyle w:val="Ttulo2"/>
       </w:pPr>
-      <w:bookmarkStart w:id="28" w:name="_Toc223898577"/>
+      <w:bookmarkStart w:id="28" w:name="_Toc225289752"/>
       <w:r>
         <w:t xml:space="preserve">6.6 </w:t>
       </w:r>
@@ -31166,6 +31234,139 @@
         </w:rPr>
         <w:t>.</w:t>
       </w:r>
+    </w:p>
+    <w:p>
+      <w:pPr>
+        <w:ind w:firstLine="0"/>
+        <w:jc w:val="both"/>
+        <w:rPr>
+          <w:rFonts w:ascii="Arial" w:hAnsi="Arial" w:cs="Arial"/>
+        </w:rPr>
+      </w:pPr>
+    </w:p>
+    <w:p>
+      <w:pPr>
+        <w:ind w:firstLine="0"/>
+        <w:jc w:val="both"/>
+        <w:rPr>
+          <w:rFonts w:ascii="Arial" w:hAnsi="Arial" w:cs="Arial"/>
+        </w:rPr>
+      </w:pPr>
+    </w:p>
+    <w:p>
+      <w:pPr>
+        <w:pStyle w:val="Ttulo1"/>
+      </w:pPr>
+      <w:bookmarkStart w:id="29" w:name="_Toc225289753"/>
+      <w:r>
+        <w:t xml:space="preserve">7 </w:t>
+      </w:r>
+      <w:proofErr w:type="spellStart"/>
+      <w:r>
+        <w:t>Diagramas</w:t>
+      </w:r>
+      <w:bookmarkEnd w:id="29"/>
+      <w:proofErr w:type="spellEnd"/>
+    </w:p>
+    <w:p>
+      <w:pPr>
+        <w:ind w:firstLine="0"/>
+        <w:jc w:val="both"/>
+        <w:rPr>
+          <w:rFonts w:ascii="Arial" w:hAnsi="Arial" w:cs="Arial"/>
+        </w:rPr>
+      </w:pPr>
+    </w:p>
+    <w:p>
+      <w:pPr>
+        <w:pStyle w:val="Ttulo2"/>
+      </w:pPr>
+      <w:bookmarkStart w:id="30" w:name="_Toc225289754"/>
+      <w:r>
+        <w:t>7.1 Caso de Uso</w:t>
+      </w:r>
+      <w:bookmarkEnd w:id="30"/>
+    </w:p>
+    <w:p>
+      <w:pPr>
+        <w:ind w:firstLine="0"/>
+        <w:jc w:val="both"/>
+        <w:rPr>
+          <w:rFonts w:ascii="Arial" w:hAnsi="Arial" w:cs="Arial"/>
+        </w:rPr>
+      </w:pPr>
+    </w:p>
+    <w:p>
+      <w:pPr>
+        <w:ind w:firstLine="0"/>
+        <w:jc w:val="both"/>
+        <w:rPr>
+          <w:rFonts w:ascii="Arial" w:hAnsi="Arial" w:cs="Arial"/>
+        </w:rPr>
+      </w:pPr>
+      <w:r>
+        <w:rPr>
+          <w:noProof/>
+        </w:rPr>
+        <w:lastRenderedPageBreak/>
+        <w:drawing>
+          <wp:inline distT="0" distB="0" distL="0" distR="0">
+            <wp:extent cx="5972175" cy="2000250"/>
+            <wp:effectExtent l="0" t="0" r="9525" b="0"/>
+            <wp:docPr id="1368628163" name="Imagem 2"/>
+            <wp:cNvGraphicFramePr>
+              <a:graphicFrameLocks xmlns:a="http://schemas.openxmlformats.org/drawingml/2006/main" noChangeAspect="1"/>
+            </wp:cNvGraphicFramePr>
+            <a:graphic xmlns:a="http://schemas.openxmlformats.org/drawingml/2006/main">
+              <a:graphicData uri="http://schemas.openxmlformats.org/drawingml/2006/picture">
+                <pic:pic xmlns:pic="http://schemas.openxmlformats.org/drawingml/2006/picture">
+                  <pic:nvPicPr>
+                    <pic:cNvPr id="0" name="Picture 3"/>
+                    <pic:cNvPicPr>
+                      <a:picLocks noChangeAspect="1" noChangeArrowheads="1"/>
+                    </pic:cNvPicPr>
+                  </pic:nvPicPr>
+                  <pic:blipFill>
+                    <a:blip r:embed="rId10">
+                      <a:extLst>
+                        <a:ext uri="{28A0092B-C50C-407E-A947-70E740481C1C}">
+                          <a14:useLocalDpi xmlns:a14="http://schemas.microsoft.com/office/drawing/2010/main" val="0"/>
+                        </a:ext>
+                      </a:extLst>
+                    </a:blip>
+                    <a:srcRect/>
+                    <a:stretch>
+                      <a:fillRect/>
+                    </a:stretch>
+                  </pic:blipFill>
+                  <pic:spPr bwMode="auto">
+                    <a:xfrm>
+                      <a:off x="0" y="0"/>
+                      <a:ext cx="5972175" cy="2000250"/>
+                    </a:xfrm>
+                    <a:prstGeom prst="rect">
+                      <a:avLst/>
+                    </a:prstGeom>
+                    <a:noFill/>
+                    <a:ln>
+                      <a:noFill/>
+                    </a:ln>
+                  </pic:spPr>
+                </pic:pic>
+              </a:graphicData>
+            </a:graphic>
+          </wp:inline>
+        </w:drawing>
+      </w:r>
+    </w:p>
+    <w:p>
+      <w:pPr>
+        <w:ind w:firstLine="0"/>
+        <w:jc w:val="both"/>
+        <w:rPr>
+          <w:rFonts w:ascii="Arial" w:hAnsi="Arial" w:cs="Arial"/>
+        </w:rPr>
+      </w:pPr>
     </w:p>
     <w:p>
       <w:pPr>

</xml_diff>